<commit_message>
Prepare responsibility split release for public sync
Validate the completed coordinator and service decomposition as one V3 delivery candidate. Sanitize current-tree examples and documentation, remove tracked signed artifacts and user state, fix AVFoundation Live Photo metadata identifiers, and refresh regression contracts. Preserve Classic White snapshots and App icon assets unchanged.
</commit_message>
<xml_diff>
--- a/Docs/UserGuide/时光记-首次使用指南.docx
+++ b/Docs/UserGuide/时光记-首次使用指南.docx
@@ -264,7 +264,7 @@
     </w:p>
     <w:p>
       <w:r>
-        <w:t>示例：主体“小满” + 生日锚点 + 照片拍摄日期 → 1岁2个月18天。</w:t>
+        <w:t>示例：主体“示例昵称” + 生日锚点 + 照片拍摄日期 → 1岁2个月18天。</w:t>
       </w:r>
     </w:p>
     <w:p>
@@ -272,7 +272,7 @@
         <w:pStyle w:val="ListBullet"/>
       </w:pPr>
       <w:r>
-        <w:t>自然：今天小满1岁2个月18天</w:t>
+        <w:t>自然：今天示例昵称1岁2个月18天</w:t>
       </w:r>
     </w:p>
     <w:p>
@@ -280,7 +280,7 @@
         <w:pStyle w:val="ListBullet"/>
       </w:pPr>
       <w:r>
-        <w:t>成长：小满长到1岁2个月18天了</w:t>
+        <w:t>成长：示例昵称长到1岁2个月18天了</w:t>
       </w:r>
     </w:p>
     <w:p>
@@ -288,7 +288,7 @@
         <w:pStyle w:val="ListBullet"/>
       </w:pPr>
       <w:r>
-        <w:t>温馨：陪小满走到1岁2个月18天</w:t>
+        <w:t>温馨：陪示例昵称走到1岁2个月18天</w:t>
       </w:r>
     </w:p>
     <w:p>
@@ -296,7 +296,7 @@
         <w:pStyle w:val="ListBullet"/>
       </w:pPr>
       <w:r>
-        <w:t>极简：小满｜1岁2个月18天</w:t>
+        <w:t>极简：示例昵称｜1岁2个月18天</w:t>
       </w:r>
     </w:p>
     <w:p>
@@ -408,14 +408,6 @@
       </w:pPr>
       <w:r>
         <w:t>邮件：serydoo@gmail.com</w:t>
-      </w:r>
-    </w:p>
-    <w:p>
-      <w:pPr>
-        <w:pStyle w:val="ListBullet"/>
-      </w:pPr>
-      <w:r>
-        <w:t>小红书：ID 49956456623</w:t>
       </w:r>
     </w:p>
     <w:sectPr>

</xml_diff>